<commit_message>
fix(JBI): cut display items to 8 (move DE table to Supplementary)
JBI limit: main figures + tables <= 8. Was 9 (6 figs + 3 tables). Moved the
per-dataset/meta-analytic DE table to Supplementary and renumbered:
- Old Table 2 (differential expression) -> Supplementary Table 1
- Old Table 3 (association: raw/adjusted/decomposition) -> Table 2
- Main display items now 8 (6 figures + 2 tables); Supplementary = 1 table + 1 figure.

Also synced table values to the QA'd numbers: AD decomposition p 0.10->0.15,
DE GSE58640 IDI2-AS1 +0.247->+0.246, de-causalized footnotes ("residual"
not "direct effect"), GSE136825 unmatched-control caveat, xCell ~70%
corroboration footnote pointing to Fig 6.

New: manuscript/tables_jbi.md (+Tables_JBI.docx), manuscript/supplementary_jbi.md
(+Supplementary_JBI.docx). In-text refs renumbered across methods/results/figure
legends; title page counts updated. Manuscript docx rebuilt (0 unresolved cites).

Co-Authored-By: Claude Opus 4.8 <noreply@anthropic.com>
</commit_message>
<xml_diff>
--- a/manuscript/full_manuscript_jbi.docx
+++ b/manuscript/full_manuscript_jbi.docx
@@ -266,7 +266,25 @@
         <w:t xml:space="preserve"> </w:t>
       </w:r>
       <w:r>
-        <w:t xml:space="preserve">3</w:t>
+        <w:t xml:space="preserve">2 main + 1 supplementary</w:t>
+      </w:r>
+    </w:p>
+    <w:p>
+      <w:pPr>
+        <w:pStyle w:val="BodyText"/>
+      </w:pPr>
+      <w:r>
+        <w:rPr>
+          <w:b/>
+          <w:bCs/>
+        </w:rPr>
+        <w:t xml:space="preserve">Display items (main figures + main tables).</w:t>
+      </w:r>
+      <w:r>
+        <w:t xml:space="preserve"> </w:t>
+      </w:r>
+      <w:r>
+        <w:t xml:space="preserve">8 (6 figures + 2 tables)</w:t>
       </w:r>
     </w:p>
     <w:p>
@@ -1693,7 +1711,7 @@
         <w:t xml:space="preserve">IL5</w:t>
       </w:r>
       <w:r>
-        <w:t xml:space="preserve">-dependent steps (Table 2). Detectable</w:t>
+        <w:t xml:space="preserve">-dependent steps (Supplementary Table 1). Detectable</w:t>
       </w:r>
       <w:r>
         <w:t xml:space="preserve"> </w:t>
@@ -2336,7 +2354,7 @@
         <w:t xml:space="preserve">2</w:t>
       </w:r>
       <w:r>
-        <w:t xml:space="preserve">(FPKM + 1) values. Pairwise Spearman correlation was computed per dataset (Fig. 3; Table 3). To test whether bulk</w:t>
+        <w:t xml:space="preserve">(FPKM + 1) values. Pairwise Spearman correlation was computed per dataset (Fig. 3; Table 2). To test whether bulk</w:t>
       </w:r>
       <w:r>
         <w:t xml:space="preserve"> </w:t>
@@ -2452,7 +2470,7 @@
         <w:t xml:space="preserve">]</w:t>
       </w:r>
       <w:r>
-        <w:t xml:space="preserve">, conditioning on both signatures (Fig. 4 and Supplementary Fig. 1; Table 3).</w:t>
+        <w:t xml:space="preserve">, conditioning on both signatures (Fig. 4 and Supplementary Fig. 1; Table 2).</w:t>
       </w:r>
     </w:p>
     <w:p>
@@ -2934,7 +2952,7 @@
         <w:t xml:space="preserve"> </w:t>
       </w:r>
       <w:r>
-        <w:t xml:space="preserve">was small and non-significant in every dataset (Table 2): log</w:t>
+        <w:t xml:space="preserve">was small and non-significant in every dataset (Supplementary Table 1): log</w:t>
       </w:r>
       <w:r>
         <w:rPr>
@@ -3294,7 +3312,7 @@
         <w:t xml:space="preserve"> </w:t>
       </w:r>
       <w:r>
-        <w:t xml:space="preserve">in the four cohorts where both transcripts were reliably quantified (Fig. 3; Table 3). Contrary to the cell-line prediction of a negative association — the in vitro mechanism implies loss of</w:t>
+        <w:t xml:space="preserve">in the four cohorts where both transcripts were reliably quantified (Fig. 3; Table 2). Contrary to the cell-line prediction of a negative association — the in vitro mechanism implies loss of</w:t>
       </w:r>
       <w:r>
         <w:t xml:space="preserve"> </w:t>
@@ -3480,7 +3498,7 @@
         <w:t xml:space="preserve"> </w:t>
       </w:r>
       <w:r>
-        <w:t xml:space="preserve">relationship as a partial Spearman correlation conditioning on both signatures (Fig. 4 and Supplementary Fig. 1; Table 3). Adjustment attenuated the estimate in the three cohorts with a non-trivial raw association, abolishing it in asthma: the asthma Spearman ρ dropped from +0.109 (</w:t>
+        <w:t xml:space="preserve">relationship as a partial Spearman correlation conditioning on both signatures (Fig. 4 and Supplementary Fig. 1; Table 2). Adjustment attenuated the estimate in the three cohorts with a non-trivial raw association, abolishing it in asthma: the asthma Spearman ρ dropped from +0.109 (</w:t>
       </w:r>
       <w:r>
         <w:rPr>
@@ -4450,7 +4468,7 @@
         <w:t xml:space="preserve"> </w:t>
       </w:r>
       <w:r>
-        <w:t xml:space="preserve">in all five; Table 2), so the contrast in pooled estimates should be read as descriptive rather than as a formally matched comparison. With that caveat, the flatness of</w:t>
+        <w:t xml:space="preserve">in all five; Supplementary Table 1), so the contrast in pooled estimates should be read as descriptive rather than as a formally matched comparison. With that caveat, the flatness of</w:t>
       </w:r>
       <w:r>
         <w:t xml:space="preserve"> </w:t>
@@ -7157,7 +7175,7 @@
         <w:t xml:space="preserve"> </w:t>
       </w:r>
       <w:r>
-        <w:t xml:space="preserve">association in the same cohort (panel A), is the visual basis for the cell-composition explanation formally quantified as a partial Spearman correlation and a bootstrap mediation-style decomposition in Table 3. The complementary</w:t>
+        <w:t xml:space="preserve">association in the same cohort (panel A), is the visual basis for the cell-composition explanation formally quantified as a partial Spearman correlation and a bootstrap mediation-style decomposition in Table 2. The complementary</w:t>
       </w:r>
       <w:r>
         <w:t xml:space="preserve"> </w:t>

</xml_diff>

<commit_message>
edit(JBI): trim abstract by exactly 5 words (347 -> 342)
Meaning-preserving cuts:
- "a recently identified in vitro repressor of IL5" -> "an in vitro repressor of IL5" (-2)
- "not solely an artifact of the marker proxy" -> "not solely a marker-proxy artifact" (-3)
Manuscript docx rebuilt (0 unresolved citations).

Co-Authored-By: Claude Opus 4.8 <noreply@anthropic.com>
</commit_message>
<xml_diff>
--- a/manuscript/full_manuscript_jbi.docx
+++ b/manuscript/full_manuscript_jbi.docx
@@ -419,7 +419,7 @@
         <w:t xml:space="preserve">IDI2-AS1</w:t>
       </w:r>
       <w:r>
-        <w:t xml:space="preserve">, a recently identified in vitro repressor of</w:t>
+        <w:t xml:space="preserve">, an in vitro repressor of</w:t>
       </w:r>
       <w:r>
         <w:t xml:space="preserve"> </w:t>
@@ -550,7 +550,7 @@
         <w:t xml:space="preserve"> </w:t>
       </w:r>
       <w:r>
-        <w:t xml:space="preserve">= 0.76 and 0.57 for the marker and xCell estimators). The two abundance estimators were concordant (ρ = 0.62), supporting that the result is not solely an artifact of the marker proxy. The quantitative claim is restricted to asthma; the smaller cohorts are underpowered and mixed (positive raw correlations, but non-uniform adjusted/decomposition estimates) and provide qualitative context only.</w:t>
+        <w:t xml:space="preserve">= 0.76 and 0.57 for the marker and xCell estimators). The two abundance estimators were concordant (ρ = 0.62), supporting that the result is not solely a marker-proxy artifact. The quantitative claim is restricted to asthma; the smaller cohorts are underpowered and mixed (positive raw correlations, but non-uniform adjusted/decomposition estimates) and provide qualitative context only.</w:t>
       </w:r>
     </w:p>
     <w:p>

</xml_diff>